<commit_message>
Clearer figures: plain labels, matched samples, judge ROC curves
</commit_message>
<xml_diff>
--- a/writeup/nla-reconstructor-verification-writeup.docx
+++ b/writeup/nla-reconstructor-verification-writeup.docx
@@ -125,7 +125,7 @@
       <w:r>
         <w:drawing>
           <wp:inline>
-            <wp:extent cx="5334000" cy="3333749"/>
+            <wp:extent cx="5334000" cy="3200400"/>
             <wp:effectExtent b="0" l="0" r="0" t="0"/>
             <wp:docPr descr="Figure 1b. Deletion excess by claim label." title="" id="15" name="Picture"/>
             <a:graphic>
@@ -146,7 +146,7 @@
                   <pic:spPr bwMode="auto">
                     <a:xfrm>
                       <a:off x="0" y="0"/>
-                      <a:ext cx="5334000" cy="3333749"/>
+                      <a:ext cx="5334000" cy="3200400"/>
                     </a:xfrm>
                     <a:prstGeom prst="rect">
                       <a:avLst/>
@@ -194,7 +194,7 @@
       <w:r>
         <w:drawing>
           <wp:inline>
-            <wp:extent cx="5334000" cy="3333749"/>
+            <wp:extent cx="5334000" cy="3200400"/>
             <wp:effectExtent b="0" l="0" r="0" t="0"/>
             <wp:docPr descr="Figure 2a. Meaning-preserving paraphrases versus same-topic false substitutions." title="" id="18" name="Picture"/>
             <a:graphic>
@@ -215,7 +215,7 @@
                   <pic:spPr bwMode="auto">
                     <a:xfrm>
                       <a:off x="0" y="0"/>
-                      <a:ext cx="5334000" cy="3333749"/>
+                      <a:ext cx="5334000" cy="3200400"/>
                     </a:xfrm>
                     <a:prstGeom prst="rect">
                       <a:avLst/>
@@ -249,7 +249,7 @@
       <w:r>
         <w:drawing>
           <wp:inline>
-            <wp:extent cx="5334000" cy="3333749"/>
+            <wp:extent cx="5334000" cy="3200400"/>
             <wp:effectExtent b="0" l="0" r="0" t="0"/>
             <wp:docPr descr="Figure 2b. Reconstruction quality for genuine explanations and shortcut controls." title="" id="21" name="Picture"/>
             <a:graphic>
@@ -270,7 +270,7 @@
                   <pic:spPr bwMode="auto">
                     <a:xfrm>
                       <a:off x="0" y="0"/>
-                      <a:ext cx="5334000" cy="3333749"/>
+                      <a:ext cx="5334000" cy="3200400"/>
                     </a:xfrm>
                     <a:prstGeom prst="rect">
                       <a:avLst/>
@@ -312,7 +312,7 @@
       <w:r>
         <w:drawing>
           <wp:inline>
-            <wp:extent cx="5334000" cy="4572000"/>
+            <wp:extent cx="5334000" cy="4849090"/>
             <wp:effectExtent b="0" l="0" r="0" t="0"/>
             <wp:docPr descr="Figure 3a. ROC curves for reconstruction scores and recurrence." title="" id="24" name="Picture"/>
             <a:graphic>
@@ -333,7 +333,7 @@
                   <pic:spPr bwMode="auto">
                     <a:xfrm>
                       <a:off x="0" y="0"/>
-                      <a:ext cx="5334000" cy="4572000"/>
+                      <a:ext cx="5334000" cy="4849090"/>
                     </a:xfrm>
                     <a:prstGeom prst="rect">
                       <a:avLst/>

</xml_diff>

<commit_message>
Write-up: page breaks, no bookmarks
</commit_message>
<xml_diff>
--- a/writeup/nla-reconstructor-verification-writeup.docx
+++ b/writeup/nla-reconstructor-verification-writeup.docx
@@ -2,7 +2,6 @@
 <file path=word/document.xml><?xml version="1.0" encoding="utf-8"?>
 <w:document xmlns:w="http://schemas.openxmlformats.org/wordprocessingml/2006/main" xmlns:m="http://schemas.openxmlformats.org/officeDocument/2006/math" xmlns:r="http://schemas.openxmlformats.org/officeDocument/2006/relationships" xmlns:o="urn:schemas-microsoft-com:office:office" xmlns:v="urn:schemas-microsoft-com:vml" xmlns:w10="urn:schemas-microsoft-com:office:word" xmlns:a="http://schemas.openxmlformats.org/drawingml/2006/main" xmlns:pic="http://schemas.openxmlformats.org/drawingml/2006/picture" xmlns:wp="http://schemas.openxmlformats.org/drawingml/2006/wordprocessingDrawing">
   <w:body>
-    <w:bookmarkStart w:id="10" w:name="Xdd307be44f4161999fea8374161fa3a2d040477"/>
     <w:p>
       <w:pPr>
         <w:pStyle w:val="Heading1"/>
@@ -11,7 +10,6 @@
         <w:t xml:space="preserve">Can the Reconstructor Police the Verbalizer?</w:t>
       </w:r>
     </w:p>
-    <w:bookmarkStart w:id="9" w:name="X4b220c8edba1ea7566ca10ca4f103cf6c7b1c67"/>
     <w:p>
       <w:pPr>
         <w:pStyle w:val="Heading2"/>
@@ -25,12 +23,9 @@
         <w:pStyle w:val="FirstParagraph"/>
       </w:pPr>
       <w:r>
-        <w:t xml:space="preserve">[Your name]</w:t>
-      </w:r>
-    </w:p>
-    <w:bookmarkEnd w:id="9"/>
-    <w:bookmarkEnd w:id="10"/>
-    <w:bookmarkStart w:id="29" w:name="executive-summary"/>
+        <w:t xml:space="preserve">Hetansh Waghela</w:t>
+      </w:r>
+    </w:p>
     <w:p>
       <w:pPr>
         <w:pStyle w:val="Heading1"/>
@@ -72,18 +67,18 @@
           <wp:inline>
             <wp:extent cx="5334000" cy="3039139"/>
             <wp:effectExtent b="0" l="0" r="0" t="0"/>
-            <wp:docPr descr="Figure 1a. Every signal tested, with 95% context-level bootstrap intervals." title="" id="12" name="Picture"/>
+            <wp:docPr descr="Figure 1a. Every signal tested, with 95% context-level bootstrap intervals." title="" id="10" name="Picture"/>
             <a:graphic>
               <a:graphicData uri="http://schemas.openxmlformats.org/drawingml/2006/picture">
                 <pic:pic>
                   <pic:nvPicPr>
-                    <pic:cNvPr descr="nla-verifier/results/figs/fig5_forest_plot.png" id="13" name="Picture"/>
+                    <pic:cNvPr descr="nla-verifier/results/figs/fig5_forest_plot.png" id="11" name="Picture"/>
                     <pic:cNvPicPr>
                       <a:picLocks noChangeArrowheads="1" noChangeAspect="1"/>
                     </pic:cNvPicPr>
                   </pic:nvPicPr>
                   <pic:blipFill>
-                    <a:blip r:embed="rId11"/>
+                    <a:blip r:embed="rId9"/>
                     <a:stretch>
                       <a:fillRect/>
                     </a:stretch>
@@ -127,18 +122,18 @@
           <wp:inline>
             <wp:extent cx="5334000" cy="3200400"/>
             <wp:effectExtent b="0" l="0" r="0" t="0"/>
-            <wp:docPr descr="Figure 1b. Deletion excess by claim label." title="" id="15" name="Picture"/>
+            <wp:docPr descr="Figure 1b. Deletion excess by claim label." title="" id="13" name="Picture"/>
             <a:graphic>
               <a:graphicData uri="http://schemas.openxmlformats.org/drawingml/2006/picture">
                 <pic:pic>
                   <pic:nvPicPr>
-                    <pic:cNvPr descr="nla-verifier/results/figs/fig1_excess_by_label.png" id="16" name="Picture"/>
+                    <pic:cNvPr descr="nla-verifier/results/figs/fig1_excess_by_label.png" id="14" name="Picture"/>
                     <pic:cNvPicPr>
                       <a:picLocks noChangeArrowheads="1" noChangeAspect="1"/>
                     </pic:cNvPicPr>
                   </pic:nvPicPr>
                   <pic:blipFill>
-                    <a:blip r:embed="rId14"/>
+                    <a:blip r:embed="rId12"/>
                     <a:stretch>
                       <a:fillRect/>
                     </a:stretch>
@@ -196,18 +191,18 @@
           <wp:inline>
             <wp:extent cx="5334000" cy="3200400"/>
             <wp:effectExtent b="0" l="0" r="0" t="0"/>
-            <wp:docPr descr="Figure 2a. Meaning-preserving paraphrases versus same-topic false substitutions." title="" id="18" name="Picture"/>
+            <wp:docPr descr="Figure 2a. Meaning-preserving paraphrases versus same-topic false substitutions." title="" id="16" name="Picture"/>
             <a:graphic>
               <a:graphicData uri="http://schemas.openxmlformats.org/drawingml/2006/picture">
                 <pic:pic>
                   <pic:nvPicPr>
-                    <pic:cNvPr descr="nla-verifier/results/figs/fig2_paraphrase_false_substitute.png" id="19" name="Picture"/>
+                    <pic:cNvPr descr="nla-verifier/results/figs/fig2_paraphrase_false_substitute.png" id="17" name="Picture"/>
                     <pic:cNvPicPr>
                       <a:picLocks noChangeArrowheads="1" noChangeAspect="1"/>
                     </pic:cNvPicPr>
                   </pic:nvPicPr>
                   <pic:blipFill>
-                    <a:blip r:embed="rId17"/>
+                    <a:blip r:embed="rId15"/>
                     <a:stretch>
                       <a:fillRect/>
                     </a:stretch>
@@ -251,18 +246,18 @@
           <wp:inline>
             <wp:extent cx="5334000" cy="3200400"/>
             <wp:effectExtent b="0" l="0" r="0" t="0"/>
-            <wp:docPr descr="Figure 2b. Reconstruction quality for genuine explanations and shortcut controls." title="" id="21" name="Picture"/>
+            <wp:docPr descr="Figure 2b. Reconstruction quality for genuine explanations and shortcut controls." title="" id="19" name="Picture"/>
             <a:graphic>
               <a:graphicData uri="http://schemas.openxmlformats.org/drawingml/2006/picture">
                 <pic:pic>
                   <pic:nvPicPr>
-                    <pic:cNvPr descr="nla-verifier/results/figs/fig3_ar_shortcut_fve.png" id="22" name="Picture"/>
+                    <pic:cNvPr descr="nla-verifier/results/figs/fig3_ar_shortcut_fve.png" id="20" name="Picture"/>
                     <pic:cNvPicPr>
                       <a:picLocks noChangeArrowheads="1" noChangeAspect="1"/>
                     </pic:cNvPicPr>
                   </pic:nvPicPr>
                   <pic:blipFill>
-                    <a:blip r:embed="rId20"/>
+                    <a:blip r:embed="rId18"/>
                     <a:stretch>
                       <a:fillRect/>
                     </a:stretch>
@@ -314,18 +309,18 @@
           <wp:inline>
             <wp:extent cx="5334000" cy="4849090"/>
             <wp:effectExtent b="0" l="0" r="0" t="0"/>
-            <wp:docPr descr="Figure 3a. ROC curves for reconstruction scores and recurrence." title="" id="24" name="Picture"/>
+            <wp:docPr descr="Figure 3a. ROC curves for reconstruction scores and recurrence." title="" id="22" name="Picture"/>
             <a:graphic>
               <a:graphicData uri="http://schemas.openxmlformats.org/drawingml/2006/picture">
                 <pic:pic>
                   <pic:nvPicPr>
-                    <pic:cNvPr descr="nla-verifier/results/figs/fig4_roc_curves.png" id="25" name="Picture"/>
+                    <pic:cNvPr descr="nla-verifier/results/figs/fig4_roc_curves.png" id="23" name="Picture"/>
                     <pic:cNvPicPr>
                       <a:picLocks noChangeArrowheads="1" noChangeAspect="1"/>
                     </pic:cNvPicPr>
                   </pic:nvPicPr>
                   <pic:blipFill>
-                    <a:blip r:embed="rId23"/>
+                    <a:blip r:embed="rId21"/>
                     <a:stretch>
                       <a:fillRect/>
                     </a:stretch>
@@ -369,18 +364,18 @@
           <wp:inline>
             <wp:extent cx="5334000" cy="3200400"/>
             <wp:effectExtent b="0" l="0" r="0" t="0"/>
-            <wp:docPr descr="Figure 3b. Consistency filter: precision against coverage as the recurrence threshold rises." title="" id="27" name="Picture"/>
+            <wp:docPr descr="Figure 3b. Consistency filter: precision against coverage as the recurrence threshold rises." title="" id="25" name="Picture"/>
             <a:graphic>
               <a:graphicData uri="http://schemas.openxmlformats.org/drawingml/2006/picture">
                 <pic:pic>
                   <pic:nvPicPr>
-                    <pic:cNvPr descr="nla-verifier/results/figs/fig6_consistency_filter.png" id="28" name="Picture"/>
+                    <pic:cNvPr descr="nla-verifier/results/figs/fig6_consistency_filter.png" id="26" name="Picture"/>
                     <pic:cNvPicPr>
                       <a:picLocks noChangeArrowheads="1" noChangeAspect="1"/>
                     </pic:cNvPicPr>
                   </pic:nvPicPr>
                   <pic:blipFill>
-                    <a:blip r:embed="rId26"/>
+                    <a:blip r:embed="rId24"/>
                     <a:stretch>
                       <a:fillRect/>
                     </a:stretch>
@@ -423,8 +418,11 @@
         <w:t xml:space="preserve">This is one community checkpoint, so I read it as one NLA on which the proposed per-claim verifier does not work, not as a contradiction of Anthropic’s aggregate observation. Both can be true. My next step would be the same experiment on the independently trained Gemma-3-27B NLA, to see whether the inversion and the signal-to-noise gap survive a second model.</w:t>
       </w:r>
     </w:p>
-    <w:bookmarkEnd w:id="29"/>
-    <w:bookmarkStart w:id="41" w:name="main-project-write-up"/>
+    <w:p>
+      <w:r>
+        <w:br w:type="page"/>
+      </w:r>
+    </w:p>
     <w:p>
       <w:pPr>
         <w:pStyle w:val="Heading1"/>
@@ -433,7 +431,6 @@
         <w:t xml:space="preserve">Main project write-up</w:t>
       </w:r>
     </w:p>
-    <w:bookmarkStart w:id="30" w:name="seven-labeled-examples"/>
     <w:p>
       <w:pPr>
         <w:pStyle w:val="Heading2"/>
@@ -856,8 +853,6 @@
         </w:tc>
       </w:tr>
     </w:tbl>
-    <w:bookmarkEnd w:id="30"/>
-    <w:bookmarkStart w:id="31" w:name="setup"/>
     <w:p>
       <w:pPr>
         <w:pStyle w:val="Heading2"/>
@@ -901,8 +896,6 @@
         <w:t xml:space="preserve">Higher scores were fixed in advance to predict TRUE. AUROCs and 95% intervals use 1,000 context-level bootstrap samples, since claims from one context are correlated. The outcome table and pass/fail thresholds were written before scoring.</w:t>
       </w:r>
     </w:p>
-    <w:bookmarkEnd w:id="31"/>
-    <w:bookmarkStart w:id="37" w:name="results"/>
     <w:p>
       <w:pPr>
         <w:pStyle w:val="Heading2"/>
@@ -911,7 +904,6 @@
         <w:t xml:space="preserve">Results</w:t>
       </w:r>
     </w:p>
-    <w:bookmarkStart w:id="32" w:name="Xb11c12fe42f52e9ef8bbe35a620b4943aca128a"/>
     <w:p>
       <w:pPr>
         <w:pStyle w:val="Heading3"/>
@@ -928,8 +920,6 @@
         <w:t xml:space="preserve">I expected at least a weak signal here. Raw deletion excess gives AUROC 0.477 [0.452, 0.502] for TRUE against RELATED_FALSE. The result is near chance in all three data strata at 0.469, 0.488, and 0.473. Fluent rewrite deletion reaches 0.516 [0.440, 0.597], so the null is not rescued by cleaner editing.</w:t>
       </w:r>
     </w:p>
-    <w:bookmarkEnd w:id="32"/>
-    <w:bookmarkStart w:id="33" w:name="X079bf219e6441d3313bd9435ed1f57c0bc46112"/>
     <w:p>
       <w:pPr>
         <w:pStyle w:val="Heading3"/>
@@ -1032,8 +1022,6 @@
         <w:t xml:space="preserve">The scale of the noise puts all of this in proportion. The matched pairs say truth is worth about 0.001 MSE. Deletion excess has a standard deviation of 0.0368, about 37 times larger, and edit wording is not the cause: the median within-claim standard deviation across three fluent rewrites is 0.0008. The TRUE-minus-RELATED_FALSE mean gap is -0.0022 with a naive claim-level standard error of 0.0015. Even a real aggregate trend of this size would be buried at the level of one claim.</w:t>
       </w:r>
     </w:p>
-    <w:bookmarkEnd w:id="33"/>
-    <w:bookmarkStart w:id="34" w:name="the-reconstructor-reads-meaning-and-gist"/>
     <w:p>
       <w:pPr>
         <w:pStyle w:val="Heading3"/>
@@ -1050,8 +1038,6 @@
         <w:t xml:space="preserve">The negative result is not explained by a dead reconstructor. Genuine explanations achieve mean FVE 0.637 [0.610, 0.661], compared with 0.002 [-0.037, 0.040] for shuffled explanations, -0.263 [-0.314, -0.212] for source copies, and -0.777 [-0.818, -0.733] for mismatched explanations. Paraphrases barely change MSE, and deletion excess has small correlations with claim length and position, 0.025 and 0.096. The instrument reads broad meaning. Truth is the missing part on this comparison.</w:t>
       </w:r>
     </w:p>
-    <w:bookmarkEnd w:id="34"/>
-    <w:bookmarkStart w:id="35" w:name="X447c107ec5cc7d14ad5b64366f7a1e0d21f92cf"/>
     <w:p>
       <w:pPr>
         <w:pStyle w:val="Heading3"/>
@@ -1084,8 +1070,6 @@
         <w:t xml:space="preserve">The judge baselines locate the bottleneck. DeepSeek given only the explanation reaches 0.522 [0.471, 0.570]. With source text it reaches 0.920 [0.894, 0.944]. Plausible fabrications fool a reader who lacks the source as easily as they fool the reconstructor. The problem is information access, not task difficulty.</w:t>
       </w:r>
     </w:p>
-    <w:bookmarkEnd w:id="35"/>
-    <w:bookmarkStart w:id="36" w:name="relation-to-anthropics-pilot"/>
     <w:p>
       <w:pPr>
         <w:pStyle w:val="Heading3"/>
@@ -1110,9 +1094,6 @@
         <w:t xml:space="preserve">A context fact-check reward could reduce claims that can be checked against the input. It has no answer key for claims about model cognition, which are often the point of an audit. If the solo inversion repeats elsewhere, the guessing pressure may survive in that uncheckable region. Recurrence can still be computed there, though recurrence does not prove that a cognition claim is true.</w:t>
       </w:r>
     </w:p>
-    <w:bookmarkEnd w:id="36"/>
-    <w:bookmarkEnd w:id="37"/>
-    <w:bookmarkStart w:id="38" w:name="what-i-verified"/>
     <w:p>
       <w:pPr>
         <w:pStyle w:val="Heading2"/>
@@ -1259,8 +1240,6 @@
         <w:t xml:space="preserve">I used batched generation only after an eight-fixture FVE equivalence check passed, and batched AR scoring only after every row stayed below the 1% relative-difference threshold.</w:t>
       </w:r>
     </w:p>
-    <w:bookmarkEnd w:id="38"/>
-    <w:bookmarkStart w:id="39" w:name="limitations"/>
     <w:p>
       <w:pPr>
         <w:pStyle w:val="Heading2"/>
@@ -1325,8 +1304,6 @@
         <w:t xml:space="preserve">The analysis verifies context claims because they have ground truth. It cannot directly establish the truth of claims about internal cognition.</w:t>
       </w:r>
     </w:p>
-    <w:bookmarkEnd w:id="39"/>
-    <w:bookmarkStart w:id="40" w:name="next-steps"/>
     <w:p>
       <w:pPr>
         <w:pStyle w:val="Heading2"/>
@@ -1343,9 +1320,11 @@
         <w:t xml:space="preserve">If I had another 20 hours I would not add more controls to this checkpoint. I would rerun deletion and solo scoring on Anthropic’s released Gemma-3-27B NLA using the same contexts, labels, and analysis code. I would add a fresh human label pass and compare recurrence from repeated samples of one activation with recurrence across neighboring positions. If the inversion repeats, I would then test whether context fact-check reward training removes it or only moves it into claims that cannot be checked.</w:t>
       </w:r>
     </w:p>
-    <w:bookmarkEnd w:id="40"/>
-    <w:bookmarkEnd w:id="41"/>
-    <w:bookmarkStart w:id="46" w:name="appendix"/>
+    <w:p>
+      <w:r>
+        <w:br w:type="page"/>
+      </w:r>
+    </w:p>
     <w:p>
       <w:pPr>
         <w:pStyle w:val="Heading1"/>
@@ -1354,7 +1333,6 @@
         <w:t xml:space="preserve">Appendix</w:t>
       </w:r>
     </w:p>
-    <w:bookmarkStart w:id="42" w:name="time"/>
     <w:p>
       <w:pPr>
         <w:pStyle w:val="Heading3"/>
@@ -1425,8 +1403,6 @@
         <w:t xml:space="preserve">[PASTE TOGGL SCREENSHOT HERE]</w:t>
       </w:r>
     </w:p>
-    <w:bookmarkEnd w:id="42"/>
-    <w:bookmarkStart w:id="43" w:name="llm-and-agent-usage"/>
     <w:p>
       <w:pPr>
         <w:pStyle w:val="Heading3"/>
@@ -1467,8 +1443,6 @@
         <w:t xml:space="preserve">How surprised I would be by a major error: very surprised in the headline AUROC, the label distribution, and the controls, which were computed two ways and gated. Moderately surprised in the recurrence counts, which rest on a crude matcher validated only against one noisy reference. Least surprised in the agent-written join between explanation samples and their sibling scores, which I reviewed only through its previews and gates rather than line by line.</w:t>
       </w:r>
     </w:p>
-    <w:bookmarkEnd w:id="43"/>
-    <w:bookmarkStart w:id="44" w:name="links"/>
     <w:p>
       <w:pPr>
         <w:pStyle w:val="Heading3"/>
@@ -1648,74 +1622,6 @@
         <w:t xml:space="preserve">)</w:t>
       </w:r>
     </w:p>
-    <w:bookmarkEnd w:id="44"/>
-    <w:bookmarkStart w:id="45" w:name="submission-checklist"/>
-    <w:p>
-      <w:pPr>
-        <w:pStyle w:val="Heading2"/>
-      </w:pPr>
-      <w:r>
-        <w:t xml:space="preserve">Submission checklist</w:t>
-      </w:r>
-    </w:p>
-    <w:p>
-      <w:pPr>
-        <w:pStyle w:val="FirstParagraph"/>
-      </w:pPr>
-      <w:r>
-        <w:t xml:space="preserve">Remove this checklist before submitting.</w:t>
-      </w:r>
-    </w:p>
-    <w:p>
-      <w:pPr>
-        <w:pStyle w:val="Compact"/>
-        <w:numPr>
-          <w:ilvl w:val="0"/>
-          <w:numId w:val="1003"/>
-        </w:numPr>
-      </w:pPr>
-      <w:r>
-        <w:t xml:space="preserve">Replace the time, screenshot, name, and repository placeholders.</w:t>
-      </w:r>
-    </w:p>
-    <w:p>
-      <w:pPr>
-        <w:pStyle w:val="Compact"/>
-        <w:numPr>
-          <w:ilvl w:val="0"/>
-          <w:numId w:val="1004"/>
-        </w:numPr>
-      </w:pPr>
-      <w:r>
-        <w:t xml:space="preserve">Keep the main text under about eight Google Doc pages before the appendix.</w:t>
-      </w:r>
-    </w:p>
-    <w:p>
-      <w:pPr>
-        <w:pStyle w:val="Compact"/>
-        <w:numPr>
-          <w:ilvl w:val="0"/>
-          <w:numId w:val="1005"/>
-        </w:numPr>
-      </w:pPr>
-      <w:r>
-        <w:t xml:space="preserve">Set Share to “Anyone with the link” and Viewer.</w:t>
-      </w:r>
-    </w:p>
-    <w:p>
-      <w:pPr>
-        <w:pStyle w:val="Compact"/>
-        <w:numPr>
-          <w:ilvl w:val="0"/>
-          <w:numId w:val="1006"/>
-        </w:numPr>
-      </w:pPr>
-      <w:r>
-        <w:t xml:space="preserve">Open the link in an incognito window and confirm that it works without signing in.</w:t>
-      </w:r>
-    </w:p>
-    <w:bookmarkEnd w:id="45"/>
-    <w:bookmarkEnd w:id="46"/>
     <w:sectPr>
       <w:footnotePr>
         <w:numRestart w:val="eachSect"/>
@@ -1929,82 +1835,6 @@
       </w:rPr>
     </w:lvl>
   </w:abstractNum>
-  <w:abstractNum w:abstractNumId="992">
-    <w:nsid w:val="0000A992"/>
-    <w:multiLevelType w:val="multilevel"/>
-    <w:lvl w:ilvl="0">
-      <w:numFmt w:val="bullet"/>
-      <w:lvlText w:val="☐"/>
-      <w:lvlJc w:val="left"/>
-      <w:pPr>
-        <w:ind w:left="720" w:hanging="360"/>
-      </w:pPr>
-    </w:lvl>
-    <w:lvl w:ilvl="1">
-      <w:numFmt w:val="bullet"/>
-      <w:lvlText w:val="☐"/>
-      <w:lvlJc w:val="left"/>
-      <w:pPr>
-        <w:ind w:left="1440" w:hanging="360"/>
-      </w:pPr>
-    </w:lvl>
-    <w:lvl w:ilvl="2">
-      <w:numFmt w:val="bullet"/>
-      <w:lvlText w:val="☐"/>
-      <w:lvlJc w:val="left"/>
-      <w:pPr>
-        <w:ind w:left="2160" w:hanging="360"/>
-      </w:pPr>
-    </w:lvl>
-    <w:lvl w:ilvl="3">
-      <w:numFmt w:val="bullet"/>
-      <w:lvlText w:val="☐"/>
-      <w:lvlJc w:val="left"/>
-      <w:pPr>
-        <w:ind w:left="2880" w:hanging="360"/>
-      </w:pPr>
-    </w:lvl>
-    <w:lvl w:ilvl="4">
-      <w:numFmt w:val="bullet"/>
-      <w:lvlText w:val="☐"/>
-      <w:lvlJc w:val="left"/>
-      <w:pPr>
-        <w:ind w:left="3600" w:hanging="360"/>
-      </w:pPr>
-    </w:lvl>
-    <w:lvl w:ilvl="5">
-      <w:numFmt w:val="bullet"/>
-      <w:lvlText w:val="☐"/>
-      <w:lvlJc w:val="left"/>
-      <w:pPr>
-        <w:ind w:left="4320" w:hanging="360"/>
-      </w:pPr>
-    </w:lvl>
-    <w:lvl w:ilvl="6">
-      <w:numFmt w:val="bullet"/>
-      <w:lvlText w:val="☐"/>
-      <w:lvlJc w:val="left"/>
-      <w:pPr>
-        <w:ind w:left="5040" w:hanging="360"/>
-      </w:pPr>
-    </w:lvl>
-    <w:lvl w:ilvl="7">
-      <w:numFmt w:val="bullet"/>
-      <w:lvlText w:val="☐"/>
-      <w:lvlJc w:val="left"/>
-      <w:pPr>
-        <w:ind w:left="5760" w:hanging="360"/>
-      </w:pPr>
-    </w:lvl>
-    <w:lvl w:ilvl="8">
-      <w:numFmt w:val="bullet"/>
-      <w:lvlText w:val="☐"/>
-      <w:lvlJc w:val="left"/>
-      <w:pPr>
-        <w:ind w:left="6480" w:hanging="360"/>
-      </w:pPr>
-    </w:lvl>
-  </w:abstractNum>
   <w:num w:numId="1000">
     <w:abstractNumId w:val="990"/>
   </w:num>
@@ -2013,18 +1843,6 @@
   </w:num>
   <w:num w:numId="1002">
     <w:abstractNumId w:val="991"/>
-  </w:num>
-  <w:num w:numId="1003">
-    <w:abstractNumId w:val="992"/>
-  </w:num>
-  <w:num w:numId="1004">
-    <w:abstractNumId w:val="992"/>
-  </w:num>
-  <w:num w:numId="1005">
-    <w:abstractNumId w:val="992"/>
-  </w:num>
-  <w:num w:numId="1006">
-    <w:abstractNumId w:val="992"/>
   </w:num>
 </w:numbering>
 </file>

</xml_diff>

<commit_message>
Two figures in the summary, four moved to results
</commit_message>
<xml_diff>
--- a/writeup/nla-reconstructor-verification-writeup.docx
+++ b/writeup/nla-reconstructor-verification-writeup.docx
@@ -55,7 +55,7 @@
         <w:pStyle w:val="BodyText"/>
       </w:pPr>
       <w:r>
-        <w:t xml:space="preserve">It does not work, at least not here. After subtracting the cost of deleting length-matched random spans, deletion excess separates TRUE from RELATED_FALSE claims at AUROC 0.477 [0.452, 0.502]. That is chance, and intervals for every estimate are in Figure 1a. Rewriting the deletions fluently instead of cutting them out gets 0.516 on a 200-claim subset, no better. The surprise was the third test. Scoring each claim on its own, with no surrounding explanation, gives 0.404: false claims reconstruct better than true ones. I expected a weak signal in the right direction. Deletion gave none, and solo scoring gave a clear one in the wrong direction.</w:t>
+        <w:t xml:space="preserve">It does not work, at least not here. After subtracting the cost of deleting length-matched random spans, deletion excess separates TRUE from RELATED_FALSE claims at AUROC 0.477 [0.452, 0.502]. That is chance, and intervals for every estimate are in Figure 1. Rewriting the deletions fluently instead of cutting them out gets 0.516 on a 200-claim subset, no better. The surprise was the third test. Scoring each claim on its own, with no surrounding explanation, gives 0.404: false claims reconstruct better than true ones. I expected a weak signal in the right direction. Deletion gave none, and solo scoring gave a clear one in the wrong direction.</w:t>
       </w:r>
     </w:p>
     <w:p>
@@ -65,9 +65,9 @@
       <w:r>
         <w:drawing>
           <wp:inline>
-            <wp:extent cx="5334000" cy="3039139"/>
+            <wp:extent cx="5120640" cy="2917573"/>
             <wp:effectExtent b="0" l="0" r="0" t="0"/>
-            <wp:docPr descr="Figure 1a. Every signal tested, with 95% context-level bootstrap intervals." title="" id="10" name="Picture"/>
+            <wp:docPr descr="Figure 1. Every signal tested, TRUE vs RELATED_FALSE, with 95% context-level bootstrap intervals." title="" id="10" name="Picture"/>
             <a:graphic>
               <a:graphicData uri="http://schemas.openxmlformats.org/drawingml/2006/picture">
                 <pic:pic>
@@ -86,7 +86,7 @@
                   <pic:spPr bwMode="auto">
                     <a:xfrm>
                       <a:off x="0" y="0"/>
-                      <a:ext cx="5334000" cy="3039139"/>
+                      <a:ext cx="5120640" cy="2917573"/>
                     </a:xfrm>
                     <a:prstGeom prst="rect">
                       <a:avLst/>
@@ -110,7 +110,29 @@
         <w:pStyle w:val="ImageCaption"/>
       </w:pPr>
       <w:r>
-        <w:t xml:space="preserve">Figure 1a. Every signal tested, with 95% context-level bootstrap intervals.</w:t>
+        <w:t xml:space="preserve">Figure 1. Every signal tested, TRUE vs RELATED_FALSE, with 95% context-level bootstrap intervals.</w:t>
+      </w:r>
+    </w:p>
+    <w:p>
+      <w:pPr>
+        <w:pStyle w:val="BodyText"/>
+      </w:pPr>
+      <w:r>
+        <w:t xml:space="preserve">The controls say why. True claims in this data tend to be safe and generic (</w:t>
+      </w:r>
+      <w:r>
+        <w:t xml:space="preserve">“this is a structured review”</w:t>
+      </w:r>
+      <w:r>
+        <w:t xml:space="preserve">), while fabrications supply names, dates, and exact continuations. A specific guess pins down the activation’s topic better than a safe summary does, whether or not the guess is right. When I held specificity fixed with matched pairs of paraphrases and same-topic false substitutes, truth cost almost nothing, about 0.001 MSE against per-claim noise of 0.037. The reconstructor is not asleep: genuine explanations reconstruct far better than shuffled text, source copies, or mismatched explanations. It reads meaning and gist closely. It just has no reason to care whether the details are real, because nothing in its training loss ever asked it to.</w:t>
+      </w:r>
+    </w:p>
+    <w:p>
+      <w:pPr>
+        <w:pStyle w:val="BodyText"/>
+      </w:pPr>
+      <w:r>
+        <w:t xml:space="preserve">What does work is boring and cheap: consistency. A claim that keeps reappearing when I decode the nearby token positions is more likely true, AUROC 0.665, and even a crude version of that filter lifts claim precision from 40% to 56% while keeping two thirds of the true claims. Two baselines put this in perspective. A DeepSeek v4 judge that reads only the explanation is at chance, 0.522, fooled by the same plausible fabrications. Given the source text, the same judge reaches 0.920. So the information needed to verify a claim is not in any single explanation, is partly recoverable across resamples, and is only fully there in ground truth that a deployed NLA does not have.</w:t>
       </w:r>
     </w:p>
     <w:p>
@@ -120,14 +142,14 @@
       <w:r>
         <w:drawing>
           <wp:inline>
-            <wp:extent cx="5334000" cy="3200400"/>
+            <wp:extent cx="5120640" cy="3072384"/>
             <wp:effectExtent b="0" l="0" r="0" t="0"/>
-            <wp:docPr descr="Figure 1b. Deletion excess by claim label." title="" id="13" name="Picture"/>
+            <wp:docPr descr="Figure 2. Consistency filter: precision of kept claims against coverage as the recurrence threshold rises." title="" id="13" name="Picture"/>
             <a:graphic>
               <a:graphicData uri="http://schemas.openxmlformats.org/drawingml/2006/picture">
                 <pic:pic>
                   <pic:nvPicPr>
-                    <pic:cNvPr descr="nla-verifier/results/figs/fig1_excess_by_label.png" id="14" name="Picture"/>
+                    <pic:cNvPr descr="nla-verifier/results/figs/fig6_consistency_filter.png" id="14" name="Picture"/>
                     <pic:cNvPicPr>
                       <a:picLocks noChangeArrowheads="1" noChangeAspect="1"/>
                     </pic:cNvPicPr>
@@ -141,7 +163,7 @@
                   <pic:spPr bwMode="auto">
                     <a:xfrm>
                       <a:off x="0" y="0"/>
-                      <a:ext cx="5334000" cy="3200400"/>
+                      <a:ext cx="5120640" cy="3072384"/>
                     </a:xfrm>
                     <a:prstGeom prst="rect">
                       <a:avLst/>
@@ -165,249 +187,7 @@
         <w:pStyle w:val="ImageCaption"/>
       </w:pPr>
       <w:r>
-        <w:t xml:space="preserve">Figure 1b. Deletion excess by claim label.</w:t>
-      </w:r>
-    </w:p>
-    <w:p>
-      <w:pPr>
-        <w:pStyle w:val="BodyText"/>
-      </w:pPr>
-      <w:r>
-        <w:t xml:space="preserve">The controls say why. True claims in this data tend to be safe and generic (</w:t>
-      </w:r>
-      <w:r>
-        <w:t xml:space="preserve">“this is a structured review”</w:t>
-      </w:r>
-      <w:r>
-        <w:t xml:space="preserve">), while fabrications supply names, dates, and exact continuations. A specific guess pins down the activation’s topic better than a safe summary does, whether or not the guess is right. When I held specificity fixed with matched pairs of paraphrases and same-topic false substitutes, truth cost almost nothing, about 0.001 MSE against per-claim noise of 0.037. The reconstructor is not asleep: genuine explanations reconstruct far better than shuffled text, source copies, or mismatched explanations. It reads meaning and gist closely. It just has no reason to care whether the details are real, because nothing in its training loss ever asked it to.</w:t>
-      </w:r>
-    </w:p>
-    <w:p>
-      <w:pPr>
-        <w:pStyle w:val="CaptionedFigure"/>
-      </w:pPr>
-      <w:r>
-        <w:drawing>
-          <wp:inline>
-            <wp:extent cx="5334000" cy="3200400"/>
-            <wp:effectExtent b="0" l="0" r="0" t="0"/>
-            <wp:docPr descr="Figure 2a. Meaning-preserving paraphrases versus same-topic false substitutions." title="" id="16" name="Picture"/>
-            <a:graphic>
-              <a:graphicData uri="http://schemas.openxmlformats.org/drawingml/2006/picture">
-                <pic:pic>
-                  <pic:nvPicPr>
-                    <pic:cNvPr descr="nla-verifier/results/figs/fig2_paraphrase_false_substitute.png" id="17" name="Picture"/>
-                    <pic:cNvPicPr>
-                      <a:picLocks noChangeArrowheads="1" noChangeAspect="1"/>
-                    </pic:cNvPicPr>
-                  </pic:nvPicPr>
-                  <pic:blipFill>
-                    <a:blip r:embed="rId15"/>
-                    <a:stretch>
-                      <a:fillRect/>
-                    </a:stretch>
-                  </pic:blipFill>
-                  <pic:spPr bwMode="auto">
-                    <a:xfrm>
-                      <a:off x="0" y="0"/>
-                      <a:ext cx="5334000" cy="3200400"/>
-                    </a:xfrm>
-                    <a:prstGeom prst="rect">
-                      <a:avLst/>
-                    </a:prstGeom>
-                    <a:noFill/>
-                    <a:ln w="9525">
-                      <a:noFill/>
-                      <a:headEnd/>
-                      <a:tailEnd/>
-                    </a:ln>
-                  </pic:spPr>
-                </pic:pic>
-              </a:graphicData>
-            </a:graphic>
-          </wp:inline>
-        </w:drawing>
-      </w:r>
-    </w:p>
-    <w:p>
-      <w:pPr>
-        <w:pStyle w:val="ImageCaption"/>
-      </w:pPr>
-      <w:r>
-        <w:t xml:space="preserve">Figure 2a. Meaning-preserving paraphrases versus same-topic false substitutions.</w:t>
-      </w:r>
-    </w:p>
-    <w:p>
-      <w:pPr>
-        <w:pStyle w:val="CaptionedFigure"/>
-      </w:pPr>
-      <w:r>
-        <w:drawing>
-          <wp:inline>
-            <wp:extent cx="5334000" cy="3200400"/>
-            <wp:effectExtent b="0" l="0" r="0" t="0"/>
-            <wp:docPr descr="Figure 2b. Reconstruction quality for genuine explanations and shortcut controls." title="" id="19" name="Picture"/>
-            <a:graphic>
-              <a:graphicData uri="http://schemas.openxmlformats.org/drawingml/2006/picture">
-                <pic:pic>
-                  <pic:nvPicPr>
-                    <pic:cNvPr descr="nla-verifier/results/figs/fig3_ar_shortcut_fve.png" id="20" name="Picture"/>
-                    <pic:cNvPicPr>
-                      <a:picLocks noChangeArrowheads="1" noChangeAspect="1"/>
-                    </pic:cNvPicPr>
-                  </pic:nvPicPr>
-                  <pic:blipFill>
-                    <a:blip r:embed="rId18"/>
-                    <a:stretch>
-                      <a:fillRect/>
-                    </a:stretch>
-                  </pic:blipFill>
-                  <pic:spPr bwMode="auto">
-                    <a:xfrm>
-                      <a:off x="0" y="0"/>
-                      <a:ext cx="5334000" cy="3200400"/>
-                    </a:xfrm>
-                    <a:prstGeom prst="rect">
-                      <a:avLst/>
-                    </a:prstGeom>
-                    <a:noFill/>
-                    <a:ln w="9525">
-                      <a:noFill/>
-                      <a:headEnd/>
-                      <a:tailEnd/>
-                    </a:ln>
-                  </pic:spPr>
-                </pic:pic>
-              </a:graphicData>
-            </a:graphic>
-          </wp:inline>
-        </w:drawing>
-      </w:r>
-    </w:p>
-    <w:p>
-      <w:pPr>
-        <w:pStyle w:val="ImageCaption"/>
-      </w:pPr>
-      <w:r>
-        <w:t xml:space="preserve">Figure 2b. Reconstruction quality for genuine explanations and shortcut controls.</w:t>
-      </w:r>
-    </w:p>
-    <w:p>
-      <w:pPr>
-        <w:pStyle w:val="BodyText"/>
-      </w:pPr>
-      <w:r>
-        <w:t xml:space="preserve">What does work is boring and cheap: consistency. A claim that keeps reappearing when I decode the nearby token positions is more likely true, AUROC 0.665, and even a crude version of that filter lifts claim precision from 40% to 56% while keeping two thirds of the true claims. Two baselines put this in perspective. A DeepSeek v4 judge that reads only the explanation is at chance, 0.522, fooled by the same plausible fabrications. Given the source text, the same judge reaches 0.920. So the information needed to verify a claim is not in any single explanation, is partly recoverable across resamples, and is only fully there in ground truth that a deployed NLA does not have.</w:t>
-      </w:r>
-    </w:p>
-    <w:p>
-      <w:pPr>
-        <w:pStyle w:val="CaptionedFigure"/>
-      </w:pPr>
-      <w:r>
-        <w:drawing>
-          <wp:inline>
-            <wp:extent cx="5334000" cy="4849090"/>
-            <wp:effectExtent b="0" l="0" r="0" t="0"/>
-            <wp:docPr descr="Figure 3a. ROC curves for reconstruction scores and recurrence." title="" id="22" name="Picture"/>
-            <a:graphic>
-              <a:graphicData uri="http://schemas.openxmlformats.org/drawingml/2006/picture">
-                <pic:pic>
-                  <pic:nvPicPr>
-                    <pic:cNvPr descr="nla-verifier/results/figs/fig4_roc_curves.png" id="23" name="Picture"/>
-                    <pic:cNvPicPr>
-                      <a:picLocks noChangeArrowheads="1" noChangeAspect="1"/>
-                    </pic:cNvPicPr>
-                  </pic:nvPicPr>
-                  <pic:blipFill>
-                    <a:blip r:embed="rId21"/>
-                    <a:stretch>
-                      <a:fillRect/>
-                    </a:stretch>
-                  </pic:blipFill>
-                  <pic:spPr bwMode="auto">
-                    <a:xfrm>
-                      <a:off x="0" y="0"/>
-                      <a:ext cx="5334000" cy="4849090"/>
-                    </a:xfrm>
-                    <a:prstGeom prst="rect">
-                      <a:avLst/>
-                    </a:prstGeom>
-                    <a:noFill/>
-                    <a:ln w="9525">
-                      <a:noFill/>
-                      <a:headEnd/>
-                      <a:tailEnd/>
-                    </a:ln>
-                  </pic:spPr>
-                </pic:pic>
-              </a:graphicData>
-            </a:graphic>
-          </wp:inline>
-        </w:drawing>
-      </w:r>
-    </w:p>
-    <w:p>
-      <w:pPr>
-        <w:pStyle w:val="ImageCaption"/>
-      </w:pPr>
-      <w:r>
-        <w:t xml:space="preserve">Figure 3a. ROC curves for reconstruction scores and recurrence.</w:t>
-      </w:r>
-    </w:p>
-    <w:p>
-      <w:pPr>
-        <w:pStyle w:val="CaptionedFigure"/>
-      </w:pPr>
-      <w:r>
-        <w:drawing>
-          <wp:inline>
-            <wp:extent cx="5334000" cy="3200400"/>
-            <wp:effectExtent b="0" l="0" r="0" t="0"/>
-            <wp:docPr descr="Figure 3b. Consistency filter: precision against coverage as the recurrence threshold rises." title="" id="25" name="Picture"/>
-            <a:graphic>
-              <a:graphicData uri="http://schemas.openxmlformats.org/drawingml/2006/picture">
-                <pic:pic>
-                  <pic:nvPicPr>
-                    <pic:cNvPr descr="nla-verifier/results/figs/fig6_consistency_filter.png" id="26" name="Picture"/>
-                    <pic:cNvPicPr>
-                      <a:picLocks noChangeArrowheads="1" noChangeAspect="1"/>
-                    </pic:cNvPicPr>
-                  </pic:nvPicPr>
-                  <pic:blipFill>
-                    <a:blip r:embed="rId24"/>
-                    <a:stretch>
-                      <a:fillRect/>
-                    </a:stretch>
-                  </pic:blipFill>
-                  <pic:spPr bwMode="auto">
-                    <a:xfrm>
-                      <a:off x="0" y="0"/>
-                      <a:ext cx="5334000" cy="3200400"/>
-                    </a:xfrm>
-                    <a:prstGeom prst="rect">
-                      <a:avLst/>
-                    </a:prstGeom>
-                    <a:noFill/>
-                    <a:ln w="9525">
-                      <a:noFill/>
-                      <a:headEnd/>
-                      <a:tailEnd/>
-                    </a:ln>
-                  </pic:spPr>
-                </pic:pic>
-              </a:graphicData>
-            </a:graphic>
-          </wp:inline>
-        </w:drawing>
-      </w:r>
-    </w:p>
-    <w:p>
-      <w:pPr>
-        <w:pStyle w:val="ImageCaption"/>
-      </w:pPr>
-      <w:r>
-        <w:t xml:space="preserve">Figure 3b. Consistency filter: precision against coverage as the recurrence threshold rises.</w:t>
+        <w:t xml:space="preserve">Figure 2. Consistency filter: precision of kept claims against coverage as the recurrence threshold rises.</w:t>
       </w:r>
     </w:p>
     <w:p>
@@ -922,6 +702,61 @@
     </w:p>
     <w:p>
       <w:pPr>
+        <w:pStyle w:val="CaptionedFigure"/>
+      </w:pPr>
+      <w:r>
+        <w:drawing>
+          <wp:inline>
+            <wp:extent cx="4572000" cy="2743200"/>
+            <wp:effectExtent b="0" l="0" r="0" t="0"/>
+            <wp:docPr descr="Figure 3. Deletion excess by claim label. The distributions overlap almost completely." title="" id="16" name="Picture"/>
+            <a:graphic>
+              <a:graphicData uri="http://schemas.openxmlformats.org/drawingml/2006/picture">
+                <pic:pic>
+                  <pic:nvPicPr>
+                    <pic:cNvPr descr="nla-verifier/results/figs/fig1_excess_by_label.png" id="17" name="Picture"/>
+                    <pic:cNvPicPr>
+                      <a:picLocks noChangeArrowheads="1" noChangeAspect="1"/>
+                    </pic:cNvPicPr>
+                  </pic:nvPicPr>
+                  <pic:blipFill>
+                    <a:blip r:embed="rId15"/>
+                    <a:stretch>
+                      <a:fillRect/>
+                    </a:stretch>
+                  </pic:blipFill>
+                  <pic:spPr bwMode="auto">
+                    <a:xfrm>
+                      <a:off x="0" y="0"/>
+                      <a:ext cx="4572000" cy="2743200"/>
+                    </a:xfrm>
+                    <a:prstGeom prst="rect">
+                      <a:avLst/>
+                    </a:prstGeom>
+                    <a:noFill/>
+                    <a:ln w="9525">
+                      <a:noFill/>
+                      <a:headEnd/>
+                      <a:tailEnd/>
+                    </a:ln>
+                  </pic:spPr>
+                </pic:pic>
+              </a:graphicData>
+            </a:graphic>
+          </wp:inline>
+        </w:drawing>
+      </w:r>
+    </w:p>
+    <w:p>
+      <w:pPr>
+        <w:pStyle w:val="ImageCaption"/>
+      </w:pPr>
+      <w:r>
+        <w:t xml:space="preserve">Figure 3. Deletion excess by claim label. The distributions overlap almost completely.</w:t>
+      </w:r>
+    </w:p>
+    <w:p>
+      <w:pPr>
         <w:pStyle w:val="Heading3"/>
       </w:pPr>
       <w:r>
@@ -942,6 +777,61 @@
       </w:pPr>
       <w:r>
         <w:t xml:space="preserve">A specificity effect is a plausible explanation. TRUE claims skew generic, while RELATED_FALSE claims skew toward names, dates, and precise continuations. The paired replacement experiment holds specificity roughly fixed: paraphrases move MSE by about 0.0000 on average, and same-topic false substitutes by about +0.0010, with the false version worse in 93 of 150 pairs. Reconstruction reads the topic and useful detail, but barely registers whether the detail is supported.</w:t>
+      </w:r>
+    </w:p>
+    <w:p>
+      <w:pPr>
+        <w:pStyle w:val="CaptionedFigure"/>
+      </w:pPr>
+      <w:r>
+        <w:drawing>
+          <wp:inline>
+            <wp:extent cx="4572000" cy="2743200"/>
+            <wp:effectExtent b="0" l="0" r="0" t="0"/>
+            <wp:docPr descr="Figure 4. Matched pairs: meaning-preserving paraphrase against same-topic false substitute, change in MSE relative to the genuine explanation." title="" id="19" name="Picture"/>
+            <a:graphic>
+              <a:graphicData uri="http://schemas.openxmlformats.org/drawingml/2006/picture">
+                <pic:pic>
+                  <pic:nvPicPr>
+                    <pic:cNvPr descr="nla-verifier/results/figs/fig2_paraphrase_false_substitute.png" id="20" name="Picture"/>
+                    <pic:cNvPicPr>
+                      <a:picLocks noChangeArrowheads="1" noChangeAspect="1"/>
+                    </pic:cNvPicPr>
+                  </pic:nvPicPr>
+                  <pic:blipFill>
+                    <a:blip r:embed="rId18"/>
+                    <a:stretch>
+                      <a:fillRect/>
+                    </a:stretch>
+                  </pic:blipFill>
+                  <pic:spPr bwMode="auto">
+                    <a:xfrm>
+                      <a:off x="0" y="0"/>
+                      <a:ext cx="4572000" cy="2743200"/>
+                    </a:xfrm>
+                    <a:prstGeom prst="rect">
+                      <a:avLst/>
+                    </a:prstGeom>
+                    <a:noFill/>
+                    <a:ln w="9525">
+                      <a:noFill/>
+                      <a:headEnd/>
+                      <a:tailEnd/>
+                    </a:ln>
+                  </pic:spPr>
+                </pic:pic>
+              </a:graphicData>
+            </a:graphic>
+          </wp:inline>
+        </w:drawing>
+      </w:r>
+    </w:p>
+    <w:p>
+      <w:pPr>
+        <w:pStyle w:val="ImageCaption"/>
+      </w:pPr>
+      <w:r>
+        <w:t xml:space="preserve">Figure 4. Matched pairs: meaning-preserving paraphrase against same-topic false substitute, change in MSE relative to the genuine explanation.</w:t>
       </w:r>
     </w:p>
     <w:p>
@@ -1040,6 +930,61 @@
     </w:p>
     <w:p>
       <w:pPr>
+        <w:pStyle w:val="CaptionedFigure"/>
+      </w:pPr>
+      <w:r>
+        <w:drawing>
+          <wp:inline>
+            <wp:extent cx="4572000" cy="2743200"/>
+            <wp:effectExtent b="0" l="0" r="0" t="0"/>
+            <wp:docPr descr="Figure 5. Reconstruction quality (FVE) for genuine explanations and the three shortcut controls, n=300 each." title="" id="22" name="Picture"/>
+            <a:graphic>
+              <a:graphicData uri="http://schemas.openxmlformats.org/drawingml/2006/picture">
+                <pic:pic>
+                  <pic:nvPicPr>
+                    <pic:cNvPr descr="nla-verifier/results/figs/fig3_ar_shortcut_fve.png" id="23" name="Picture"/>
+                    <pic:cNvPicPr>
+                      <a:picLocks noChangeArrowheads="1" noChangeAspect="1"/>
+                    </pic:cNvPicPr>
+                  </pic:nvPicPr>
+                  <pic:blipFill>
+                    <a:blip r:embed="rId21"/>
+                    <a:stretch>
+                      <a:fillRect/>
+                    </a:stretch>
+                  </pic:blipFill>
+                  <pic:spPr bwMode="auto">
+                    <a:xfrm>
+                      <a:off x="0" y="0"/>
+                      <a:ext cx="4572000" cy="2743200"/>
+                    </a:xfrm>
+                    <a:prstGeom prst="rect">
+                      <a:avLst/>
+                    </a:prstGeom>
+                    <a:noFill/>
+                    <a:ln w="9525">
+                      <a:noFill/>
+                      <a:headEnd/>
+                      <a:tailEnd/>
+                    </a:ln>
+                  </pic:spPr>
+                </pic:pic>
+              </a:graphicData>
+            </a:graphic>
+          </wp:inline>
+        </w:drawing>
+      </w:r>
+    </w:p>
+    <w:p>
+      <w:pPr>
+        <w:pStyle w:val="ImageCaption"/>
+      </w:pPr>
+      <w:r>
+        <w:t xml:space="preserve">Figure 5. Reconstruction quality (FVE) for genuine explanations and the three shortcut controls, n=300 each.</w:t>
+      </w:r>
+    </w:p>
+    <w:p>
+      <w:pPr>
         <w:pStyle w:val="Heading3"/>
       </w:pPr>
       <w:r>
@@ -1068,6 +1013,61 @@
       </w:pPr>
       <w:r>
         <w:t xml:space="preserve">The judge baselines locate the bottleneck. DeepSeek given only the explanation reaches 0.522 [0.471, 0.570]. With source text it reaches 0.920 [0.894, 0.944]. Plausible fabrications fool a reader who lacks the source as easily as they fool the reconstructor. The problem is information access, not task difficulty.</w:t>
+      </w:r>
+    </w:p>
+    <w:p>
+      <w:pPr>
+        <w:pStyle w:val="CaptionedFigure"/>
+      </w:pPr>
+      <w:r>
+        <w:drawing>
+          <wp:inline>
+            <wp:extent cx="4206240" cy="3823854"/>
+            <wp:effectExtent b="0" l="0" r="0" t="0"/>
+            <wp:docPr descr="Figure 6. ROC curves for every signal, including the two judge baselines." title="" id="25" name="Picture"/>
+            <a:graphic>
+              <a:graphicData uri="http://schemas.openxmlformats.org/drawingml/2006/picture">
+                <pic:pic>
+                  <pic:nvPicPr>
+                    <pic:cNvPr descr="nla-verifier/results/figs/fig4_roc_curves.png" id="26" name="Picture"/>
+                    <pic:cNvPicPr>
+                      <a:picLocks noChangeArrowheads="1" noChangeAspect="1"/>
+                    </pic:cNvPicPr>
+                  </pic:nvPicPr>
+                  <pic:blipFill>
+                    <a:blip r:embed="rId24"/>
+                    <a:stretch>
+                      <a:fillRect/>
+                    </a:stretch>
+                  </pic:blipFill>
+                  <pic:spPr bwMode="auto">
+                    <a:xfrm>
+                      <a:off x="0" y="0"/>
+                      <a:ext cx="4206240" cy="3823854"/>
+                    </a:xfrm>
+                    <a:prstGeom prst="rect">
+                      <a:avLst/>
+                    </a:prstGeom>
+                    <a:noFill/>
+                    <a:ln w="9525">
+                      <a:noFill/>
+                      <a:headEnd/>
+                      <a:tailEnd/>
+                    </a:ln>
+                  </pic:spPr>
+                </pic:pic>
+              </a:graphicData>
+            </a:graphic>
+          </wp:inline>
+        </w:drawing>
+      </w:r>
+    </w:p>
+    <w:p>
+      <w:pPr>
+        <w:pStyle w:val="ImageCaption"/>
+      </w:pPr>
+      <w:r>
+        <w:t xml:space="preserve">Figure 6. ROC curves for every signal, including the two judge baselines.</w:t>
       </w:r>
     </w:p>
     <w:p>

</xml_diff>